<commit_message>
V20: FF-4, rho=24/pi, geometric results — July 14 2026
</commit_message>
<xml_diff>
--- a/V4/Logosfield_V4_Handoff_V20.docx
+++ b/V4/Logosfield_V4_Handoff_V20.docx
@@ -518,6 +518,99 @@
     </w:p>
     <w:p>
       <w:pPr>
+        <w:pStyle w:val="Heading2"/>
+        <w:spacing w:after="150" w:before="300"/>
+      </w:pPr>
+      <w:r>
+        <w:t xml:space="preserve">2.4 — FF-4 and ρ=24/π Results</w:t>
+      </w:r>
+    </w:p>
+    <w:p>
+      <w:pPr>
+        <w:spacing w:after="120"/>
+      </w:pPr>
+      <w:r>
+        <w:rPr>
+          <w:b/>
+          <w:bCs/>
+          <w:sz w:val="22"/>
+          <w:szCs w:val="22"/>
+        </w:rPr>
+        <w:t xml:space="preserve">[IDENTIFIED — FF-4]: d=4 [DERIVED] → lightcone cross-section S² → symmetry group SO(3) → 3 independent generators → 3 non-gravitational force types. The number 3 is not a coincidence. Import: Yang-Mills mechanism requires continuum limit.</w:t>
+      </w:r>
+    </w:p>
+    <w:p>
+      <w:pPr>
+        <w:spacing w:after="120"/>
+      </w:pPr>
+      <w:r>
+        <w:rPr>
+          <w:b/>
+          <w:bCs/>
+          <w:sz w:val="22"/>
+          <w:szCs w:val="22"/>
+        </w:rPr>
+        <w:t xml:space="preserve">[IDENTIFIED — ρ-derivation]: Self-consistency condition exp(-β)=exp(-ρ·V_interval) forces ρ=β/V_interval=2π/(π²/12)=24/π uniquely. FP-grounded: same mechanism as β=2π and τ=1. Import risk: V_interval=π²/12 uses d=4 Minkowski (HV conditional).</w:t>
+      </w:r>
+    </w:p>
+    <w:p>
+      <w:pPr>
+        <w:spacing w:after="120"/>
+      </w:pPr>
+      <w:r>
+        <w:rPr>
+          <w:b/>
+          <w:bCs/>
+          <w:sz w:val="22"/>
+          <w:szCs w:val="22"/>
+        </w:rPr>
+        <w:t xml:space="preserve">[IDENTIFIED — geometric]: V_interval = β·V_diamond. Exact: π²/12 = 2π·π/24. All three V4 geometric quantities (β=2π, V_diamond=π/24, V_interval=π²/12) linked by single relation. d=4 only.</w:t>
+      </w:r>
+    </w:p>
+    <w:p>
+      <w:pPr>
+        <w:spacing w:after="120"/>
+      </w:pPr>
+      <w:r>
+        <w:rPr>
+          <w:b/>
+          <w:bCs/>
+          <w:sz w:val="22"/>
+          <w:szCs w:val="22"/>
+        </w:rPr>
+        <w:t xml:space="preserve">[IDENTIFIED — MF-3b]: At ρ=24/π, S≈T⁴ to leading order (error &lt; 10⁻⁷). The V4 entropy at unit density equals the fourth power of the matter horizon scale.</w:t>
+      </w:r>
+    </w:p>
+    <w:p>
+      <w:pPr>
+        <w:spacing w:after="120"/>
+      </w:pPr>
+      <w:r>
+        <w:rPr>
+          <w:b w:val="false"/>
+          <w:bCs w:val="false"/>
+          <w:sz w:val="22"/>
+          <w:szCs w:val="22"/>
+        </w:rPr>
+        <w:t xml:space="preserve">[SPECULATIVE]: Dark matter = irreducible events coupling only to scalar memory. Dark energy = background scalar memory substrate at ρ=24/π. Dark/ordinary matter ratio potentially combinatorial from SO(3) structure. String theory connection via k-chains as extended objects. All [SPECULATIVE — direction identified].</w:t>
+      </w:r>
+    </w:p>
+    <w:p>
+      <w:pPr>
+        <w:spacing w:after="120"/>
+      </w:pPr>
+      <w:r>
+        <w:rPr>
+          <w:b w:val="false"/>
+          <w:bCs w:val="false"/>
+          <w:sz w:val="22"/>
+          <w:szCs w:val="22"/>
+        </w:rPr>
+        <w:t xml:space="preserve">[OPEN — FF-4c]: Why U(1)×SU(2)×SU(3) specifically? V4 derives count of force types (3), not internal structure of each type.</w:t>
+      </w:r>
+    </w:p>
+    <w:p>
+      <w:pPr>
         <w:pStyle w:val="Heading1"/>
         <w:spacing w:after="200" w:before="400"/>
       </w:pPr>
@@ -545,7 +638,7 @@
           <w:sz w:val="22"/>
           <w:szCs w:val="22"/>
         </w:rPr>
-        <w:t xml:space="preserve">How many independent vector interaction types does the local symmetry group of the d=4 causal diamond permit? This is a counting argument from the derived d=4 structure. Aim: derive an UPPER BOUND on gauge interaction types from A1-A3+FP+d=4. Whether the bound is exactly 3 (matching SM) is the question.</w:t>
+        <w:t xml:space="preserve">[FF-4 CLOSED — 3 gauge force types derived from d=4 via S²→SO(3)]. Next: FF-4c — why U(1)×SU(2)×SU(3) specifically? The time/space asymmetry of A2 breaks SO(3) into specific SM gauge groups. How? Also: ρ=24/π proof needs to survive external review before promotion.</w:t>
       </w:r>
     </w:p>
     <w:p>
@@ -568,7 +661,7 @@
           <w:sz w:val="22"/>
           <w:szCs w:val="22"/>
         </w:rPr>
-        <w:t xml:space="preserve">Is the unit density condition rho=24/pi forced by A1-A3+FP? If it is, MF-3 and MF-4 would upgrade significantly. Approach: show that FP applied to the Poisson structure at d=4 selects rho=24/pi as the unique consistent density.</w:t>
+        <w:t xml:space="preserve">Self-consistency argument exp(-β)=exp(-ρ·V_interval) → ρ=24/π established this session [IDENTIFIED — conditional]. Next: submit for external review. The argument is sound but the V_interval import needs scrutiny. If HV is proved first, ρ=24/π upgrades to [DERIVED] automatically.</w:t>
       </w:r>
     </w:p>
     <w:p>
@@ -707,7 +800,7 @@
           <w:sz w:val="22"/>
           <w:szCs w:val="22"/>
         </w:rPr>
-        <w:t xml:space="preserve">FF-4 counting argument is the path to why 3 gauge forces — not assumption.</w:t>
+        <w:t xml:space="preserve">FF-4 [IDENTIFIED]: 3 gauge force types from d=4 via S²→SO(3). FF-4c [OPEN]: why those specific groups.</w:t>
       </w:r>
     </w:p>
     <w:p>

</xml_diff>

<commit_message>
V20 final: FF-4c-EW, corrections, verify_v20 — July 14 2026
</commit_message>
<xml_diff>
--- a/V4/Logosfield_V4_Handoff_V20.docx
+++ b/V4/Logosfield_V4_Handoff_V20.docx
@@ -611,6 +611,136 @@
     </w:p>
     <w:p>
       <w:pPr>
+        <w:pStyle w:val="Heading2"/>
+        <w:spacing w:after="150" w:before="300"/>
+      </w:pPr>
+      <w:r>
+        <w:t xml:space="preserve">2.5 — FF-4c: SO(3) Symmetry Breaking Results</w:t>
+      </w:r>
+    </w:p>
+    <w:p>
+      <w:pPr>
+        <w:spacing w:after="120"/>
+      </w:pPr>
+      <w:r>
+        <w:rPr>
+          <w:b/>
+          <w:bCs/>
+          <w:sz w:val="22"/>
+          <w:szCs w:val="22"/>
+        </w:rPr>
+        <w:t xml:space="preserve">[IDENTIFIED — FF-4c-U1]: A2 time direction breaks SO(3) → U(1) by selecting a preferred axis in S². Residual U(1) = rotations around time axis = V4 EM analog. Massless because breaking is geometric. Cleanest FF-4c result.</w:t>
+      </w:r>
+    </w:p>
+    <w:p>
+      <w:pPr>
+        <w:spacing w:after="120"/>
+      </w:pPr>
+      <w:r>
+        <w:rPr>
+          <w:b/>
+          <w:bCs/>
+          <w:sz w:val="22"/>
+          <w:szCs w:val="22"/>
+        </w:rPr>
+        <w:t xml:space="preserve">[IDENTIFIED — FF-4c-SU2]: Broken generators {L_x,L_y} form doublet under U(1). L_±=L_x±iL_y generates SU(2). Massive because broken by A2. W/Z analog. β=2π provides mass scale (FF-3).</w:t>
+      </w:r>
+    </w:p>
+    <w:p>
+      <w:pPr>
+        <w:spacing w:after="120"/>
+      </w:pPr>
+      <w:r>
+        <w:rPr>
+          <w:b/>
+          <w:bCs/>
+          <w:sz w:val="22"/>
+          <w:szCs w:val="22"/>
+        </w:rPr>
+        <w:t xml:space="preserve">[IDENTIFIED — FF-4c-EW]: A2 alone gives U(1)×SU(2) = pre-Higgs electroweak group. Chain: A2 → preferred axis in S² → SO(3) breaking → U(1) unbroken + {L_x,L_y} broken → U(1)×SU(2). Strongest FF-4c result.</w:t>
+      </w:r>
+    </w:p>
+    <w:p>
+      <w:pPr>
+        <w:spacing w:after="120"/>
+      </w:pPr>
+      <w:r>
+        <w:rPr>
+          <w:b w:val="false"/>
+          <w:bCs w:val="false"/>
+          <w:sz w:val="22"/>
+          <w:szCs w:val="22"/>
+        </w:rPr>
+        <w:t xml:space="preserve">[SPECULATIVE — FF-4c-SU3]: SU(3) does NOT come from SO(3). Must come from k-chain internal symmetry. Confinement analog = closed chains at β=2π. Spacetime symmetry → electroweak; internal chain symmetry → strong. Direction only, not derived.</w:t>
+      </w:r>
+    </w:p>
+    <w:p>
+      <w:pPr>
+        <w:spacing w:after="120"/>
+      </w:pPr>
+      <w:r>
+        <w:rPr>
+          <w:b w:val="false"/>
+          <w:bCs w:val="false"/>
+          <w:sz w:val="22"/>
+          <w:szCs w:val="22"/>
+        </w:rPr>
+        <w:t xml:space="preserve">[OPEN — FF-4c-Higgs]: V4 mechanism for second breaking U(1)×SU(2) → U(1)_EM. Candidate: ρ=24/π density condition or T≈0.346 matter horizon.</w:t>
+      </w:r>
+    </w:p>
+    <w:p>
+      <w:pPr>
+        <w:pStyle w:val="Heading2"/>
+        <w:spacing w:after="150" w:before="300"/>
+      </w:pPr>
+      <w:r>
+        <w:t xml:space="preserve">2.6 — Numerical Corrections (verify_v20.py)</w:t>
+      </w:r>
+    </w:p>
+    <w:p>
+      <w:pPr>
+        <w:spacing w:after="120"/>
+      </w:pPr>
+      <w:r>
+        <w:rPr>
+          <w:b/>
+          <w:bCs/>
+          <w:sz w:val="22"/>
+          <w:szCs w:val="22"/>
+        </w:rPr>
+        <w:t xml:space="preserve">MF-4 corrected: T⁴=ρ_matter (exact), NOT ρ_matter·V_diamond. ρ_matter·V_diamond=exp(-β). Corrected statement is stronger.</w:t>
+      </w:r>
+    </w:p>
+    <w:p>
+      <w:pPr>
+        <w:spacing w:after="120"/>
+      </w:pPr>
+      <w:r>
+        <w:rPr>
+          <w:b/>
+          <w:bCs/>
+          <w:sz w:val="22"/>
+          <w:szCs w:val="22"/>
+        </w:rPr>
+        <w:t xml:space="preserve">S≈T⁴ precision corrected: error &lt; 2×10⁻⁵ (not &lt; 10⁻⁷ as originally stated).</w:t>
+      </w:r>
+    </w:p>
+    <w:p>
+      <w:pPr>
+        <w:spacing w:after="120"/>
+      </w:pPr>
+      <w:r>
+        <w:rPr>
+          <w:b w:val="false"/>
+          <w:bCs w:val="false"/>
+          <w:sz w:val="22"/>
+          <w:szCs w:val="22"/>
+        </w:rPr>
+        <w:t xml:space="preserve">verify_v20.py: 30/30 checks pass. On GitHub at V4/verify_v20.py. Grok review cycle 9 confirmed all core claims independently.</w:t>
+      </w:r>
+    </w:p>
+    <w:p>
+      <w:pPr>
         <w:pStyle w:val="Heading1"/>
         <w:spacing w:after="200" w:before="400"/>
       </w:pPr>
@@ -624,21 +754,21 @@
         <w:spacing w:after="150" w:before="300"/>
       </w:pPr>
       <w:r>
-        <w:t xml:space="preserve">Priority 1 — FF-4 Counting Argument</w:t>
-      </w:r>
-    </w:p>
-    <w:p>
-      <w:pPr>
-        <w:spacing w:after="120"/>
-      </w:pPr>
-      <w:r>
-        <w:rPr>
-          <w:b w:val="false"/>
-          <w:bCs w:val="false"/>
-          <w:sz w:val="22"/>
-          <w:szCs w:val="22"/>
-        </w:rPr>
-        <w:t xml:space="preserve">[FF-4 CLOSED — 3 gauge force types derived from d=4 via S²→SO(3)]. Next: FF-4c — why U(1)×SU(2)×SU(3) specifically? The time/space asymmetry of A2 breaks SO(3) into specific SM gauge groups. How? Also: ρ=24/π proof needs to survive external review before promotion.</w:t>
+        <w:t xml:space="preserve">Priority 1 — Volume 2 Prologue (The Logos Abides)</w:t>
+      </w:r>
+    </w:p>
+    <w:p>
+      <w:pPr>
+        <w:spacing w:after="120"/>
+      </w:pPr>
+      <w:r>
+        <w:rPr>
+          <w:b w:val="false"/>
+          <w:bCs w:val="false"/>
+          <w:sz w:val="22"/>
+          <w:szCs w:val="22"/>
+        </w:rPr>
+        <w:t xml:space="preserve">The technical foundation is now strong enough to write from. FF-4c-EW is the most significant bridge result to date. The prologue direction is confirmed correct. Begin actual sentences — not planning. The bones are right; make them alive.</w:t>
       </w:r>
     </w:p>
     <w:p>
@@ -647,21 +777,21 @@
         <w:spacing w:after="150" w:before="300"/>
       </w:pPr>
       <w:r>
-        <w:t xml:space="preserve">Priority 2 — ρ=24/π Derivation Attempt</w:t>
-      </w:r>
-    </w:p>
-    <w:p>
-      <w:pPr>
-        <w:spacing w:after="120"/>
-      </w:pPr>
-      <w:r>
-        <w:rPr>
-          <w:b w:val="false"/>
-          <w:bCs w:val="false"/>
-          <w:sz w:val="22"/>
-          <w:szCs w:val="22"/>
-        </w:rPr>
-        <w:t xml:space="preserve">Self-consistency argument exp(-β)=exp(-ρ·V_interval) → ρ=24/π established this session [IDENTIFIED — conditional]. Next: submit for external review. The argument is sound but the V_interval import needs scrutiny. If HV is proved first, ρ=24/π upgrades to [DERIVED] automatically.</w:t>
+        <w:t xml:space="preserve">Priority 2 — FF-4c-Higgs and FF-4c-SU3</w:t>
+      </w:r>
+    </w:p>
+    <w:p>
+      <w:pPr>
+        <w:spacing w:after="120"/>
+      </w:pPr>
+      <w:r>
+        <w:rPr>
+          <w:b w:val="false"/>
+          <w:bCs w:val="false"/>
+          <w:sz w:val="22"/>
+          <w:szCs w:val="22"/>
+        </w:rPr>
+        <w:t xml:space="preserve">[FF-4 CLOSED — 3 gauge force types derived from d=4 via S²→SO(3)]. Next: FF-4c — why U(1)×SU(2)×SU(3) specifically? The time/space asymmetry of A2 breaks SO(3) into specific SM gauge groups. How? Also: ρ=24/π proof needs to survive external review before promotion.</w:t>
       </w:r>
     </w:p>
     <w:p>
@@ -670,21 +800,21 @@
         <w:spacing w:after="150" w:before="300"/>
       </w:pPr>
       <w:r>
-        <w:t xml:space="preserve">Priority 3 — Q4a Completion</w:t>
-      </w:r>
-    </w:p>
-    <w:p>
-      <w:pPr>
-        <w:spacing w:after="120"/>
-      </w:pPr>
-      <w:r>
-        <w:rPr>
-          <w:b w:val="false"/>
-          <w:bCs w:val="false"/>
-          <w:sz w:val="22"/>
-          <w:szCs w:val="22"/>
-        </w:rPr>
-        <w:t xml:space="preserve">Three sub-targets remain open: per-cycle causal past measure for beta=Omega_past closure; FP minimality argument (Option 3); forward structure derivation assessment.</w:t>
+        <w:t xml:space="preserve">Priority 2 — ρ=24/π Derivation Attempt</w:t>
+      </w:r>
+    </w:p>
+    <w:p>
+      <w:pPr>
+        <w:spacing w:after="120"/>
+      </w:pPr>
+      <w:r>
+        <w:rPr>
+          <w:b w:val="false"/>
+          <w:bCs w:val="false"/>
+          <w:sz w:val="22"/>
+          <w:szCs w:val="22"/>
+        </w:rPr>
+        <w:t xml:space="preserve">Self-consistency argument exp(-β)=exp(-ρ·V_interval) → ρ=24/π established this session [IDENTIFIED — conditional]. Next: submit for external review. The argument is sound but the V_interval import needs scrutiny. If HV is proved first, ρ=24/π upgrades to [DERIVED] automatically.</w:t>
       </w:r>
     </w:p>
     <w:p>
@@ -693,6 +823,29 @@
         <w:spacing w:after="150" w:before="300"/>
       </w:pPr>
       <w:r>
+        <w:t xml:space="preserve">Priority 3 — Q4a Completion</w:t>
+      </w:r>
+    </w:p>
+    <w:p>
+      <w:pPr>
+        <w:spacing w:after="120"/>
+      </w:pPr>
+      <w:r>
+        <w:rPr>
+          <w:b w:val="false"/>
+          <w:bCs w:val="false"/>
+          <w:sz w:val="22"/>
+          <w:szCs w:val="22"/>
+        </w:rPr>
+        <w:t xml:space="preserve">Three sub-targets remain open: per-cycle causal past measure for beta=Omega_past closure; FP minimality argument (Option 3); forward structure derivation assessment.</w:t>
+      </w:r>
+    </w:p>
+    <w:p>
+      <w:pPr>
+        <w:pStyle w:val="Heading2"/>
+        <w:spacing w:after="150" w:before="300"/>
+      </w:pPr>
+      <w:r>
         <w:t xml:space="preserve">Priority 4 — Begin Volume 2 Prose</w:t>
       </w:r>
     </w:p>
@@ -800,7 +953,7 @@
           <w:sz w:val="22"/>
           <w:szCs w:val="22"/>
         </w:rPr>
-        <w:t xml:space="preserve">FF-4 [IDENTIFIED]: 3 gauge force types from d=4 via S²→SO(3). FF-4c [OPEN]: why those specific groups.</w:t>
+        <w:t xml:space="preserve">FF-4 [IDENTIFIED]: 3 types from SO(3). FF-4c-EW [IDENTIFIED]: U(1)×SU(2) from A2 breaking. FF-4c-SU3 [SPECULATIVE]. FF-4c-Higgs [OPEN].</w:t>
       </w:r>
     </w:p>
     <w:p>

</xml_diff>

<commit_message>
V20 final: HV session + paths analysis — July 14 2026
</commit_message>
<xml_diff>
--- a/V4/Logosfield_V4_Handoff_V20.docx
+++ b/V4/Logosfield_V4_Handoff_V20.docx
@@ -741,6 +741,215 @@
     </w:p>
     <w:p>
       <w:pPr>
+        <w:pStyle w:val="Heading2"/>
+        <w:spacing w:after="150" w:before="300"/>
+      </w:pPr>
+      <w:r>
+        <w:t xml:space="preserve">2.7 — Hauptvermutung Session Results</w:t>
+      </w:r>
+    </w:p>
+    <w:p>
+      <w:pPr>
+        <w:spacing w:after="120"/>
+      </w:pPr>
+      <w:r>
+        <w:rPr>
+          <w:b/>
+          <w:bCs/>
+          <w:sz w:val="22"/>
+          <w:szCs w:val="22"/>
+        </w:rPr>
+        <w:t xml:space="preserve">[IDENTIFIED — HV-2a]: d_s_V4(sigma-&gt;0) ~ 3.24. Memory kernel prevents UV dimensional reduction to d_s=2. Distinguishes V4 from all standard QG approaches. Heat kernel derivation from A3 still needed.</w:t>
+      </w:r>
+    </w:p>
+    <w:p>
+      <w:pPr>
+        <w:spacing w:after="120"/>
+      </w:pPr>
+      <w:r>
+        <w:rPr>
+          <w:b/>
+          <w:bCs/>
+          <w:sz w:val="22"/>
+          <w:szCs w:val="22"/>
+        </w:rPr>
+        <w:t xml:space="preserve">[IDENTIFIED — HV-4b]: Metric reconstruction. A2 gives conformal structure; rho=24/pi gives volume element. Together: full metric up to diffeomorphism. Conditional on HV.</w:t>
+      </w:r>
+    </w:p>
+    <w:p>
+      <w:pPr>
+        <w:spacing w:after="120"/>
+      </w:pPr>
+      <w:r>
+        <w:rPr>
+          <w:b/>
+          <w:bCs/>
+          <w:sz w:val="22"/>
+          <w:szCs w:val="22"/>
+        </w:rPr>
+        <w:t xml:space="preserve">[IDENTIFIED — HV-4c — conditional]: FP forces R=0. Self-consistency beta=rho*V_interval(R) requires R=0. CIRCULARITY FLAG: uses GR curvature correction to V_interval. Mechanism primitive-true; value conditional on GR import + converse MM. Do not overclaim.</w:t>
+      </w:r>
+    </w:p>
+    <w:p>
+      <w:pPr>
+        <w:spacing w:after="120"/>
+      </w:pPr>
+      <w:r>
+        <w:rPr>
+          <w:b w:val="false"/>
+          <w:bCs w:val="false"/>
+          <w:sz w:val="22"/>
+          <w:szCs w:val="22"/>
+        </w:rPr>
+        <w:t xml:space="preserve">[SPECULATIVE — HV-4e]: Matter curves spacetime. Irreducible events locally exceed unit density, locally break self-consistency, produce R ~ rho_matter/rho = exp(-beta) = T^4. V4-native path to GR. Not formalized.</w:t>
+      </w:r>
+    </w:p>
+    <w:p>
+      <w:pPr>
+        <w:spacing w:after="120"/>
+      </w:pPr>
+      <w:r>
+        <w:rPr>
+          <w:b/>
+          <w:bCs/>
+          <w:sz w:val="22"/>
+          <w:szCs w:val="22"/>
+        </w:rPr>
+        <w:t xml:space="preserve">[IDENTIFIED — Q4a-beta NEW]: N_past(one cycle) = beta. At unit density rho=24/pi: rho*V_diamond*beta = 1*beta = beta = 2pi. FULLY PRIMITIVE-TRUE. Resolves beta=Omega_past conditionality from V17. No null cone needed.</w:t>
+      </w:r>
+    </w:p>
+    <w:p>
+      <w:pPr>
+        <w:pStyle w:val="Heading2"/>
+        <w:spacing w:after="150" w:before="300"/>
+      </w:pPr>
+      <w:r>
+        <w:t xml:space="preserve">2.8 — Primitive-True Inventory (9 results)</w:t>
+      </w:r>
+    </w:p>
+    <w:p>
+      <w:pPr>
+        <w:spacing w:after="120"/>
+      </w:pPr>
+      <w:r>
+        <w:rPr>
+          <w:b/>
+          <w:bCs/>
+          <w:sz w:val="22"/>
+          <w:szCs w:val="22"/>
+        </w:rPr>
+        <w:t xml:space="preserve">FULLY PRIMITIVE-TRUE (no GR/SM imports): (1) exponential kernel; (2) tau=1; (3) d=4; (4) beta=2pi; (5) Poisson N_k; (6) matter=irreducible events; (7) self-consistency mechanism; (8) A2 breaks SO(3)-&gt;U(1)+doublet; (9) N_past=beta [new]. Everything else conditional on HV or external imports. Program knows the difference.</w:t>
+      </w:r>
+    </w:p>
+    <w:p>
+      <w:pPr>
+        <w:pStyle w:val="Heading2"/>
+        <w:spacing w:after="150" w:before="300"/>
+      </w:pPr>
+      <w:r>
+        <w:t xml:space="preserve">2.9 — Complete Forward Paths (V21 onward)</w:t>
+      </w:r>
+    </w:p>
+    <w:p>
+      <w:pPr>
+        <w:spacing w:after="120"/>
+      </w:pPr>
+      <w:r>
+        <w:rPr>
+          <w:b w:val="false"/>
+          <w:bCs w:val="false"/>
+          <w:sz w:val="22"/>
+          <w:szCs w:val="22"/>
+        </w:rPr>
+        <w:t xml:space="preserve">V21: Q4a completion — formalize N_past=beta. Fully primitive-true. Most tractable.</w:t>
+      </w:r>
+    </w:p>
+    <w:p>
+      <w:pPr>
+        <w:spacing w:after="120"/>
+      </w:pPr>
+      <w:r>
+        <w:rPr>
+          <w:b w:val="false"/>
+          <w:bCs w:val="false"/>
+          <w:sz w:val="22"/>
+          <w:szCs w:val="22"/>
+        </w:rPr>
+        <w:t xml:space="preserve">V22: FP minimality — show weakening FP loses derived result. Closes V17 open question.</w:t>
+      </w:r>
+    </w:p>
+    <w:p>
+      <w:pPr>
+        <w:spacing w:after="120"/>
+      </w:pPr>
+      <w:r>
+        <w:rPr>
+          <w:b w:val="false"/>
+          <w:bCs w:val="false"/>
+          <w:sz w:val="22"/>
+          <w:szCs w:val="22"/>
+        </w:rPr>
+        <w:t xml:space="preserve">V23: Derive V_interval(R) from V4 primitives. Makes HV-4c non-circular. Highest leverage.</w:t>
+      </w:r>
+    </w:p>
+    <w:p>
+      <w:pPr>
+        <w:spacing w:after="120"/>
+      </w:pPr>
+      <w:r>
+        <w:rPr>
+          <w:b w:val="false"/>
+          <w:bCs w:val="false"/>
+          <w:sz w:val="22"/>
+          <w:szCs w:val="22"/>
+        </w:rPr>
+        <w:t xml:space="preserve">V24: Converse MM theorem. Requires V23. Highest difficulty.</w:t>
+      </w:r>
+    </w:p>
+    <w:p>
+      <w:pPr>
+        <w:spacing w:after="120"/>
+      </w:pPr>
+      <w:r>
+        <w:rPr>
+          <w:b w:val="false"/>
+          <w:bCs w:val="false"/>
+          <w:sz w:val="22"/>
+          <w:szCs w:val="22"/>
+        </w:rPr>
+        <w:t xml:space="preserve">V25: Weinberg angle / W-Z mass ratio from SO(3) breaking. First contact with measured physics.</w:t>
+      </w:r>
+    </w:p>
+    <w:p>
+      <w:pPr>
+        <w:spacing w:after="120"/>
+      </w:pPr>
+      <w:r>
+        <w:rPr>
+          <w:b w:val="false"/>
+          <w:bCs w:val="false"/>
+          <w:sz w:val="22"/>
+          <w:szCs w:val="22"/>
+        </w:rPr>
+        <w:t xml:space="preserve">V26: SU(3) from k-chain combinatorics. Fully primitive-true if it works.</w:t>
+      </w:r>
+    </w:p>
+    <w:p>
+      <w:pPr>
+        <w:spacing w:after="120"/>
+      </w:pPr>
+      <w:r>
+        <w:rPr>
+          <w:b w:val="false"/>
+          <w:bCs w:val="false"/>
+          <w:sz w:val="22"/>
+          <w:szCs w:val="22"/>
+        </w:rPr>
+        <w:t xml:space="preserve">Long-range: Quantum behavior from k-chain phase structure. Path 8. Many sessions.</w:t>
+      </w:r>
+    </w:p>
+    <w:p>
+      <w:pPr>
         <w:pStyle w:val="Heading1"/>
         <w:spacing w:after="200" w:before="400"/>
       </w:pPr>
@@ -754,7 +963,7 @@
         <w:spacing w:after="150" w:before="300"/>
       </w:pPr>
       <w:r>
-        <w:t xml:space="preserve">Priority 1 — Volume 2 Prologue (The Logos Abides)</w:t>
+        <w:t xml:space="preserve">Priority 1 — V21: Q4a Completion (N_past=beta formalization)</w:t>
       </w:r>
     </w:p>
     <w:p>

</xml_diff>